<commit_message>
Reduce Risk and Mitigations table by 1 row
The 'Risk and Mitigations with status' table on page 3 shipped with 4
blank data rows (plus header); reduced to 3. Removed the last empty
row's XML directly, matched by its unique paraId (each of the 4 rows
differs only in paraId/rsid attributes, not content, so this is a
precise removal rather than a heuristic one).

Note: this table's heading text ('Risk and Mitigations with status')
also appears once earlier in the Table of Contents, so the fix
explicitly anchors on the SECOND occurrence to reach the real heading
and its actual table, not the TOC entry.

Verified via a full rebuild (all templatize_tsr.py assertions pass,
including a row-count check before the removal) and a real end-to-end
Playwright generation, confirming the table now renders with exactly
3 empty rows instead of 4. Bumped TSR_TEMPLATE_VERSION (2 -> 3) since
the template changed, and the outer cache-bust version (v=32 -> v=33)
since app.js changed too.
</commit_message>
<xml_diff>
--- a/assets/tsr_master_template.docx
+++ b/assets/tsr_master_template.docx
@@ -4221,171 +4221,6 @@
             <w:tcW w:w="1231" w:type="dxa"/>
             <w:vAlign w:val="center"/>
             <w:hideMark/>
-          </w:tcPr>
-          <w:p>
-            <w:pPr>
-              <w:widowControl/>
-              <w:autoSpaceDE/>
-              <w:autoSpaceDN/>
-              <w:rPr>
-                <w:rFonts w:ascii="Times New Roman" w:hAnsi="Times New Roman"/>
-                <w:color w:val="auto"/>
-                <w:sz w:val="24"/>
-                <w:szCs w:val="24"/>
-                <w:lang w:bidi="ar-SA"/>
-              </w:rPr>
-            </w:pPr>
-          </w:p>
-        </w:tc>
-        <w:tc>
-          <w:tcPr>
-            <w:tcW w:w="1387" w:type="dxa"/>
-            <w:vAlign w:val="center"/>
-          </w:tcPr>
-          <w:p>
-            <w:pPr>
-              <w:widowControl/>
-              <w:autoSpaceDE/>
-              <w:autoSpaceDN/>
-              <w:rPr>
-                <w:rFonts w:ascii="Times New Roman" w:hAnsi="Times New Roman"/>
-                <w:color w:val="auto"/>
-                <w:sz w:val="24"/>
-                <w:szCs w:val="24"/>
-                <w:lang w:bidi="ar-SA"/>
-              </w:rPr>
-            </w:pPr>
-          </w:p>
-        </w:tc>
-        <w:tc>
-          <w:tcPr>
-            <w:tcW w:w="821" w:type="dxa"/>
-            <w:vAlign w:val="center"/>
-          </w:tcPr>
-          <w:p>
-            <w:pPr>
-              <w:widowControl/>
-              <w:autoSpaceDE/>
-              <w:autoSpaceDN/>
-              <w:rPr>
-                <w:rFonts w:ascii="Times New Roman" w:hAnsi="Times New Roman"/>
-                <w:color w:val="auto"/>
-                <w:sz w:val="24"/>
-                <w:szCs w:val="24"/>
-                <w:lang w:bidi="ar-SA"/>
-              </w:rPr>
-            </w:pPr>
-          </w:p>
-        </w:tc>
-        <w:tc>
-          <w:tcPr>
-            <w:tcW w:w="1246" w:type="dxa"/>
-            <w:vAlign w:val="center"/>
-          </w:tcPr>
-          <w:p>
-            <w:pPr>
-              <w:widowControl/>
-              <w:autoSpaceDE/>
-              <w:autoSpaceDN/>
-              <w:rPr>
-                <w:rFonts w:ascii="Times New Roman" w:hAnsi="Times New Roman"/>
-                <w:color w:val="auto"/>
-                <w:sz w:val="24"/>
-                <w:szCs w:val="24"/>
-                <w:lang w:bidi="ar-SA"/>
-              </w:rPr>
-            </w:pPr>
-          </w:p>
-        </w:tc>
-        <w:tc>
-          <w:tcPr>
-            <w:tcW w:w="962" w:type="dxa"/>
-            <w:vAlign w:val="center"/>
-          </w:tcPr>
-          <w:p>
-            <w:pPr>
-              <w:widowControl/>
-              <w:autoSpaceDE/>
-              <w:autoSpaceDN/>
-              <w:rPr>
-                <w:rFonts w:ascii="Times New Roman" w:hAnsi="Times New Roman"/>
-                <w:color w:val="auto"/>
-                <w:sz w:val="24"/>
-                <w:szCs w:val="24"/>
-                <w:lang w:bidi="ar-SA"/>
-              </w:rPr>
-            </w:pPr>
-          </w:p>
-        </w:tc>
-        <w:tc>
-          <w:tcPr>
-            <w:tcW w:w="1529" w:type="dxa"/>
-            <w:vAlign w:val="center"/>
-          </w:tcPr>
-          <w:p>
-            <w:pPr>
-              <w:widowControl/>
-              <w:autoSpaceDE/>
-              <w:autoSpaceDN/>
-              <w:rPr>
-                <w:rFonts w:ascii="Times New Roman" w:hAnsi="Times New Roman"/>
-                <w:color w:val="auto"/>
-                <w:sz w:val="24"/>
-                <w:szCs w:val="24"/>
-                <w:lang w:bidi="ar-SA"/>
-              </w:rPr>
-            </w:pPr>
-          </w:p>
-        </w:tc>
-        <w:tc>
-          <w:tcPr>
-            <w:tcW w:w="970" w:type="dxa"/>
-            <w:vAlign w:val="center"/>
-          </w:tcPr>
-          <w:p>
-            <w:pPr>
-              <w:widowControl/>
-              <w:autoSpaceDE/>
-              <w:autoSpaceDN/>
-              <w:rPr>
-                <w:rFonts w:ascii="Times New Roman" w:hAnsi="Times New Roman"/>
-                <w:color w:val="auto"/>
-                <w:sz w:val="24"/>
-                <w:szCs w:val="24"/>
-                <w:lang w:bidi="ar-SA"/>
-              </w:rPr>
-            </w:pPr>
-          </w:p>
-        </w:tc>
-        <w:tc>
-          <w:tcPr>
-            <w:tcW w:w="806" w:type="dxa"/>
-            <w:vAlign w:val="center"/>
-          </w:tcPr>
-          <w:p>
-            <w:pPr>
-              <w:widowControl/>
-              <w:autoSpaceDE/>
-              <w:autoSpaceDN/>
-              <w:rPr>
-                <w:rFonts w:ascii="Times New Roman" w:hAnsi="Times New Roman"/>
-                <w:color w:val="auto"/>
-                <w:sz w:val="24"/>
-                <w:szCs w:val="24"/>
-                <w:lang w:bidi="ar-SA"/>
-              </w:rPr>
-            </w:pPr>
-          </w:p>
-        </w:tc>
-      </w:tr>
-      <w:tr>
-        <w:trPr>
-          <w:tblCellSpacing w:w="15" w:type="dxa"/>
-        </w:trPr>
-        <w:tc>
-          <w:tcPr>
-            <w:tcW w:w="1231" w:type="dxa"/>
-            <w:vAlign w:val="center"/>
           </w:tcPr>
           <w:p>
             <w:pPr>

</xml_diff>